<commit_message>
Add Home tab to top nav 2026-05-29 00:42
</commit_message>
<xml_diff>
--- a/generated/Team/Growth_Team_Org_Chart_V2.docx
+++ b/generated/Team/Growth_Team_Org_Chart_V2.docx
@@ -1790,6 +1790,12 @@
               <w:jc w:val="center"/>
             </w:pPr>
             <w:r>
+              <w:rPr>
+                <w:rFonts w:ascii="Calibri Light" w:hAnsi="Calibri Light"/>
+                <w:b/>
+                <w:color w:val="0B2C4D"/>
+                <w:sz w:val="28"/>
+              </w:rPr>
               <w:t xml:space="preserve">Brandon Solomon</w:t>
             </w:r>
           </w:p>

</xml_diff>

<commit_message>
Fix h2 panel headings in dark mode (dark plum on dark bg was unreadable) 2026-05-29 01:20
</commit_message>
<xml_diff>
--- a/generated/Team/Growth_Team_Org_Chart_V2.docx
+++ b/generated/Team/Growth_Team_Org_Chart_V2.docx
@@ -52,7 +52,7 @@
     </w:p>
     <w:p>
       <w:pPr>
-        <w:spacing w:before="0" w:after="160"/>
+        <w:spacing w:before="0" w:after="80"/>
         <w:jc w:val="center"/>
       </w:pPr>
       <w:r>
@@ -63,7 +63,7 @@
           <w:color w:val="6B7686"/>
           <w:sz w:val="18"/>
         </w:rPr>
-        <w:t>As of May 28, 2026    ·    Main line: (888) 890-4965</w:t>
+        <w:t>As of May 29, 2026    ·    Main line: (888) 890-4965</w:t>
       </w:r>
     </w:p>
     <w:tbl>
@@ -100,9 +100,7 @@
             <w:pPr>
               <w:jc w:val="center"/>
             </w:pPr>
-            <w:r>
-              <w:t>28</w:t>
-            </w:r>
+            <w:r/>
             <w:r>
               <w:rPr>
                 <w:rFonts w:ascii="Calibri Light" w:hAnsi="Calibri Light"/>
@@ -111,6 +109,7 @@
                 <w:color w:val="0B2C4D"/>
                 <w:sz w:val="36"/>
               </w:rPr>
+              <w:t>28</w:t>
             </w:r>
           </w:p>
           <w:p>
@@ -151,9 +150,7 @@
             <w:pPr>
               <w:jc w:val="center"/>
             </w:pPr>
-            <w:r>
-              <w:t>5</w:t>
-            </w:r>
+            <w:r/>
             <w:r>
               <w:rPr>
                 <w:rFonts w:ascii="Calibri Light" w:hAnsi="Calibri Light"/>
@@ -162,6 +159,7 @@
                 <w:color w:val="0B2C4D"/>
                 <w:sz w:val="36"/>
               </w:rPr>
+              <w:t>5</w:t>
             </w:r>
           </w:p>
           <w:p>
@@ -202,9 +200,7 @@
             <w:pPr>
               <w:jc w:val="center"/>
             </w:pPr>
-            <w:r>
-              <w:t>8</w:t>
-            </w:r>
+            <w:r/>
             <w:r>
               <w:rPr>
                 <w:rFonts w:ascii="Calibri Light" w:hAnsi="Calibri Light"/>
@@ -213,6 +209,7 @@
                 <w:color w:val="0B2C4D"/>
                 <w:sz w:val="36"/>
               </w:rPr>
+              <w:t>8</w:t>
             </w:r>
           </w:p>
           <w:p>
@@ -320,9 +317,7 @@
             <w:pPr>
               <w:jc w:val="center"/>
             </w:pPr>
-            <w:r>
-              <w:t>5 OPEN ROLES</w:t>
-            </w:r>
+            <w:r/>
             <w:r>
               <w:rPr>
                 <w:rFonts w:ascii="Calibri Light" w:hAnsi="Calibri Light"/>
@@ -331,6 +326,7 @@
                 <w:color w:val="C78C1F"/>
                 <w:sz w:val="20"/>
               </w:rPr>
+              <w:t>5 OPEN ROLES</w:t>
             </w:r>
           </w:p>
           <w:p>
@@ -346,7 +342,7 @@
                 <w:color w:val="2D3644"/>
                 <w:sz w:val="19"/>
               </w:rPr>
-              <w:t>BDM Northeast · BDA Southwest  ·  BDA Central · Agency Success Associate · Fleet PBRM</w:t>
+              <w:t>BDM Northeast  ·  BDA Southwest  ·  BDA Central  ·  Agency Success Associate  ·  Fleet PBRM</w:t>
             </w:r>
           </w:p>
         </w:tc>
@@ -354,7 +350,7 @@
     </w:tbl>
     <w:p>
       <w:pPr>
-        <w:spacing w:before="0" w:after="120"/>
+        <w:spacing w:before="0" w:after="60"/>
       </w:pPr>
     </w:p>
     <w:tbl>
@@ -911,12 +907,12 @@
     </w:tbl>
     <w:p>
       <w:pPr>
-        <w:spacing w:before="0" w:after="120"/>
+        <w:spacing w:before="0" w:after="60"/>
       </w:pPr>
     </w:p>
     <w:p>
       <w:pPr>
-        <w:spacing w:before="160" w:after="80"/>
+        <w:spacing w:before="60" w:after="20"/>
       </w:pPr>
       <w:r>
         <w:rPr>
@@ -1070,7 +1066,7 @@
     </w:p>
     <w:p>
       <w:pPr>
-        <w:spacing w:before="160" w:after="80"/>
+        <w:spacing w:before="60" w:after="20"/>
       </w:pPr>
       <w:r>
         <w:rPr>
@@ -1323,17 +1319,17 @@
         <w:tblLook w:firstColumn="1" w:firstRow="1" w:lastColumn="0" w:lastRow="0" w:noHBand="0" w:noVBand="1" w:val="04A0"/>
       </w:tblPr>
       <w:tblGrid>
-        <w:gridCol w:w="2896"/>
-        <w:gridCol w:w="2896"/>
-        <w:gridCol w:w="2896"/>
-        <w:gridCol w:w="2896"/>
-        <w:gridCol w:w="2896"/>
-        <w:gridCol w:w="2896"/>
+        <w:gridCol w:w="2413"/>
+        <w:gridCol w:w="2413"/>
+        <w:gridCol w:w="2413"/>
+        <w:gridCol w:w="2413"/>
+        <w:gridCol w:w="2413"/>
+        <w:gridCol w:w="2413"/>
       </w:tblGrid>
       <w:tr>
         <w:tc>
           <w:tcPr>
-            <w:tcW w:type="dxa" w:w="2765"/>
+            <w:tcW w:type="dxa" w:w="2304"/>
             <w:shd w:val="clear" w:color="auto" w:fill="F8FAFC"/>
             <w:tcBorders>
               <w:top w:val="single" w:sz="4" w:color="D9DEE5"/>
@@ -1433,7 +1429,7 @@
         </w:tc>
         <w:tc>
           <w:tcPr>
-            <w:tcW w:type="dxa" w:w="2765"/>
+            <w:tcW w:type="dxa" w:w="2304"/>
             <w:shd w:val="clear" w:color="auto" w:fill="F8FAFC"/>
             <w:tcBorders>
               <w:top w:val="single" w:sz="4" w:color="D9DEE5"/>
@@ -1533,7 +1529,7 @@
         </w:tc>
         <w:tc>
           <w:tcPr>
-            <w:tcW w:type="dxa" w:w="2765"/>
+            <w:tcW w:type="dxa" w:w="2304"/>
             <w:shd w:val="clear" w:color="auto" w:fill="F8FAFC"/>
             <w:tcBorders>
               <w:top w:val="single" w:sz="4" w:color="D9DEE5"/>
@@ -1617,7 +1613,7 @@
         </w:tc>
         <w:tc>
           <w:tcPr>
-            <w:tcW w:type="dxa" w:w="2765"/>
+            <w:tcW w:type="dxa" w:w="2304"/>
             <w:shd w:val="clear" w:color="auto" w:fill="F8FAFC"/>
             <w:tcBorders>
               <w:top w:val="single" w:sz="4" w:color="D9DEE5"/>
@@ -1701,7 +1697,7 @@
         </w:tc>
         <w:tc>
           <w:tcPr>
-            <w:tcW w:type="dxa" w:w="2765"/>
+            <w:tcW w:type="dxa" w:w="2304"/>
             <w:shd w:val="clear" w:color="auto" w:fill="F8FAFC"/>
             <w:tcBorders>
               <w:top w:val="single" w:sz="4" w:color="D9DEE5"/>
@@ -1769,7 +1765,7 @@
         </w:tc>
         <w:tc>
           <w:tcPr>
-            <w:tcW w:type="dxa" w:w="2765"/>
+            <w:tcW w:type="dxa" w:w="2304"/>
             <w:shd w:val="clear" w:color="auto" w:fill="F8FAFC"/>
             <w:tcBorders>
               <w:top w:val="single" w:sz="4" w:color="D9DEE5"/>
@@ -1789,15 +1785,18 @@
               <w:spacing w:before="0" w:after="0"/>
               <w:jc w:val="center"/>
             </w:pPr>
-            <w:r>
-              <w:rPr>
-                <w:rFonts w:ascii="Calibri Light" w:hAnsi="Calibri Light"/>
-                <w:b/>
-                <w:color w:val="0B2C4D"/>
-                <w:sz w:val="28"/>
-              </w:rPr>
-              <w:t xml:space="preserve">Brandon Solomon</w:t>
-            </w:r>
+            <w:r/>
+            <w:hyperlink r:id="rId23">
+              <w:r>
+                <w:rPr>
+                  <w:color w:val="1B4F8A"/>
+                  <w:rFonts w:ascii="Calibri Light" w:hAnsi="Calibri Light"/>
+                  <w:sz w:val="20"/>
+                  <w:b/>
+                </w:rPr>
+                <w:t xml:space="preserve">Brandon Solomon</w:t>
+              </w:r>
+            </w:hyperlink>
           </w:p>
           <w:p>
             <w:pPr>
@@ -1812,7 +1811,7 @@
                 <w:color w:val="6B7686"/>
                 <w:sz w:val="17"/>
               </w:rPr>
-              <w:t xml:space="preserve">BDM · Midwest · (report to Roland) · started May 26, 2026</w:t>
+              <w:t>BDM · Midwest · (report to Roland) · started May 2026</w:t>
             </w:r>
           </w:p>
         </w:tc>
@@ -1876,7 +1875,7 @@
               <w:jc w:val="center"/>
             </w:pPr>
             <w:r/>
-            <w:hyperlink r:id="rId23">
+            <w:hyperlink r:id="rId24">
               <w:r>
                 <w:rPr>
                   <w:color w:val="1B4F8A"/>
@@ -1960,7 +1959,7 @@
               <w:jc w:val="center"/>
             </w:pPr>
             <w:r/>
-            <w:hyperlink r:id="rId24">
+            <w:hyperlink r:id="rId25">
               <w:r>
                 <w:rPr>
                   <w:color w:val="1B4F8A"/>
@@ -2028,7 +2027,7 @@
               <w:jc w:val="center"/>
             </w:pPr>
             <w:r/>
-            <w:hyperlink r:id="rId25">
+            <w:hyperlink r:id="rId26">
               <w:r>
                 <w:rPr>
                   <w:color w:val="1B4F8A"/>
@@ -2096,7 +2095,7 @@
               <w:jc w:val="center"/>
             </w:pPr>
             <w:r/>
-            <w:hyperlink r:id="rId26">
+            <w:hyperlink r:id="rId27">
               <w:r>
                 <w:rPr>
                   <w:color w:val="1B4F8A"/>
@@ -2164,7 +2163,7 @@
               <w:jc w:val="center"/>
             </w:pPr>
             <w:r/>
-            <w:hyperlink r:id="rId27">
+            <w:hyperlink r:id="rId28">
               <w:r>
                 <w:rPr>
                   <w:color w:val="1B4F8A"/>
@@ -2232,7 +2231,7 @@
               <w:jc w:val="center"/>
             </w:pPr>
             <w:r/>
-            <w:hyperlink r:id="rId28">
+            <w:hyperlink r:id="rId29">
               <w:r>
                 <w:rPr>
                   <w:color w:val="1B4F8A"/>
@@ -2334,7 +2333,7 @@
               <w:jc w:val="center"/>
             </w:pPr>
             <w:r/>
-            <w:hyperlink r:id="rId29">
+            <w:hyperlink r:id="rId30">
               <w:r>
                 <w:rPr>
                   <w:color w:val="C7651F"/>
@@ -2418,7 +2417,7 @@
               <w:jc w:val="center"/>
             </w:pPr>
             <w:r/>
-            <w:hyperlink r:id="rId30">
+            <w:hyperlink r:id="rId31">
               <w:r>
                 <w:rPr>
                   <w:color w:val="C7651F"/>
@@ -2486,7 +2485,7 @@
               <w:jc w:val="center"/>
             </w:pPr>
             <w:r/>
-            <w:hyperlink r:id="rId31">
+            <w:hyperlink r:id="rId32">
               <w:r>
                 <w:rPr>
                   <w:color w:val="C7651F"/>
@@ -2587,7 +2586,7 @@
               <w:jc w:val="center"/>
             </w:pPr>
             <w:r/>
-            <w:hyperlink r:id="rId32">
+            <w:hyperlink r:id="rId33">
               <w:r>
                 <w:rPr>
                   <w:color w:val="5B21B6"/>
@@ -2671,7 +2670,7 @@
               <w:jc w:val="center"/>
             </w:pPr>
             <w:r/>
-            <w:hyperlink r:id="rId33">
+            <w:hyperlink r:id="rId34">
               <w:r>
                 <w:rPr>
                   <w:color w:val="5B21B6"/>
@@ -2725,7 +2724,7 @@
     </w:p>
     <w:p>
       <w:pPr>
-        <w:spacing w:before="160" w:after="80"/>
+        <w:spacing w:before="60" w:after="20"/>
       </w:pPr>
       <w:r>
         <w:rPr>
@@ -2773,7 +2772,7 @@
               <w:jc w:val="center"/>
             </w:pPr>
             <w:r/>
-            <w:hyperlink r:id="rId34">
+            <w:hyperlink r:id="rId35">
               <w:r>
                 <w:rPr>
                   <w:color w:val="1F6F2E"/>
@@ -2825,7 +2824,7 @@
               <w:jc w:val="center"/>
             </w:pPr>
             <w:r/>
-            <w:hyperlink r:id="rId35">
+            <w:hyperlink r:id="rId36">
               <w:r>
                 <w:rPr>
                   <w:color w:val="1F6F2E"/>
@@ -2940,7 +2939,7 @@
     </w:p>
     <w:p>
       <w:pPr>
-        <w:spacing w:before="160" w:after="80"/>
+        <w:spacing w:before="60" w:after="20"/>
       </w:pPr>
       <w:r>
         <w:rPr>
@@ -5571,150 +5570,6 @@
         <w:tc>
           <w:tcPr>
             <w:tcW w:type="dxa" w:w="2448"/>
-            <w:shd w:val="clear" w:color="auto" w:fill="F8FAFC"/>
-            <w:tcBorders>
-              <w:top w:val="single" w:sz="4" w:color="D9DEE5"/>
-              <w:left w:val="single" w:sz="4" w:color="D9DEE5"/>
-              <w:bottom w:val="single" w:sz="4" w:color="D9DEE5"/>
-              <w:right w:val="single" w:sz="4" w:color="D9DEE5"/>
-            </w:tcBorders>
-            <w:tcMar>
-              <w:top w:w="15" w:type="dxa"/>
-              <w:left w:w="90" w:type="dxa"/>
-              <w:bottom w:w="15" w:type="dxa"/>
-              <w:right w:w="90" w:type="dxa"/>
-            </w:tcMar>
-          </w:tcPr>
-          <w:p>
-            <w:pPr>
-              <w:spacing w:before="0" w:after="0"/>
-            </w:pPr>
-            <w:r>
-              <w:rPr>
-                <w:color w:val="0B2C4D"/>
-                <w:rFonts w:ascii="Calibri Light" w:hAnsi="Calibri Light"/>
-                <w:sz w:val="17"/>
-                <w:b/>
-              </w:rPr>
-              <w:t xml:space="preserve">Brandon Solomon</w:t>
-            </w:r>
-          </w:p>
-        </w:tc>
-        <w:tc>
-          <w:tcPr>
-            <w:tcW w:type="dxa" w:w="4176"/>
-            <w:shd w:val="clear" w:color="auto" w:fill="F8FAFC"/>
-            <w:tcBorders>
-              <w:top w:val="single" w:sz="4" w:color="D9DEE5"/>
-              <w:left w:val="single" w:sz="4" w:color="D9DEE5"/>
-              <w:bottom w:val="single" w:sz="4" w:color="D9DEE5"/>
-              <w:right w:val="single" w:sz="4" w:color="D9DEE5"/>
-            </w:tcBorders>
-            <w:tcMar>
-              <w:top w:w="15" w:type="dxa"/>
-              <w:left w:w="90" w:type="dxa"/>
-              <w:bottom w:w="15" w:type="dxa"/>
-              <w:right w:w="90" w:type="dxa"/>
-            </w:tcMar>
-          </w:tcPr>
-          <w:p>
-            <w:pPr>
-              <w:spacing w:before="0" w:after="0"/>
-            </w:pPr>
-            <w:r>
-              <w:t xml:space="preserve">BDM – Midwest</w:t>
-            </w:r>
-          </w:p>
-        </w:tc>
-        <w:tc>
-          <w:tcPr>
-            <w:tcW w:type="dxa" w:w="2016"/>
-            <w:shd w:val="clear" w:color="auto" w:fill="F8FAFC"/>
-            <w:tcBorders>
-              <w:top w:val="single" w:sz="4" w:color="D9DEE5"/>
-              <w:left w:val="single" w:sz="4" w:color="D9DEE5"/>
-              <w:bottom w:val="single" w:sz="4" w:color="D9DEE5"/>
-              <w:right w:val="single" w:sz="4" w:color="D9DEE5"/>
-            </w:tcBorders>
-            <w:tcMar>
-              <w:top w:w="15" w:type="dxa"/>
-              <w:left w:w="90" w:type="dxa"/>
-              <w:bottom w:w="15" w:type="dxa"/>
-              <w:right w:w="90" w:type="dxa"/>
-            </w:tcMar>
-            <w:shd w:val="clear" w:color="auto" w:fill="E5EDF7"/>
-          </w:tcPr>
-          <w:p>
-            <w:pPr>
-              <w:spacing w:before="0" w:after="0"/>
-            </w:pPr>
-            <w:r>
-              <w:t xml:space="preserve">Retail</w:t>
-            </w:r>
-          </w:p>
-        </w:tc>
-        <w:tc>
-          <w:tcPr>
-            <w:tcW w:type="dxa" w:w="3600"/>
-            <w:shd w:val="clear" w:color="auto" w:fill="F8FAFC"/>
-            <w:tcBorders>
-              <w:top w:val="single" w:sz="4" w:color="D9DEE5"/>
-              <w:left w:val="single" w:sz="4" w:color="D9DEE5"/>
-              <w:bottom w:val="single" w:sz="4" w:color="D9DEE5"/>
-              <w:right w:val="single" w:sz="4" w:color="D9DEE5"/>
-            </w:tcBorders>
-            <w:tcMar>
-              <w:top w:w="15" w:type="dxa"/>
-              <w:left w:w="90" w:type="dxa"/>
-              <w:bottom w:w="15" w:type="dxa"/>
-              <w:right w:w="90" w:type="dxa"/>
-            </w:tcMar>
-          </w:tcPr>
-          <w:p>
-            <w:pPr>
-              <w:spacing w:before="0" w:after="0"/>
-            </w:pPr>
-            <w:r>
-              <w:rPr>
-                <w:color w:val="0B2C4D"/>
-                <w:rFonts w:ascii="Calibri" w:hAnsi="Calibri"/>
-                <w:sz w:val="16"/>
-              </w:rPr>
-              <w:t xml:space="preserve">brandon.solomon@coverwhale.com</w:t>
-            </w:r>
-          </w:p>
-        </w:tc>
-        <w:tc>
-          <w:tcPr>
-            <w:tcW w:type="dxa" w:w="1584"/>
-            <w:shd w:val="clear" w:color="auto" w:fill="F8FAFC"/>
-            <w:tcBorders>
-              <w:top w:val="single" w:sz="4" w:color="D9DEE5"/>
-              <w:left w:val="single" w:sz="4" w:color="D9DEE5"/>
-              <w:bottom w:val="single" w:sz="4" w:color="D9DEE5"/>
-              <w:right w:val="single" w:sz="4" w:color="D9DEE5"/>
-            </w:tcBorders>
-            <w:tcMar>
-              <w:top w:w="15" w:type="dxa"/>
-              <w:left w:w="90" w:type="dxa"/>
-              <w:bottom w:w="15" w:type="dxa"/>
-              <w:right w:w="90" w:type="dxa"/>
-            </w:tcMar>
-          </w:tcPr>
-          <w:p>
-            <w:pPr>
-              <w:spacing w:before="0" w:after="0"/>
-            </w:pPr>
-            <w:r>
-              <w:t xml:space="preserve">—</w:t>
-            </w:r>
-          </w:p>
-        </w:tc>
-      </w:tr>
-      <w:tr>
-        <w:tc>
-          <w:tcPr>
-            <w:tcW w:type="dxa" w:w="2448"/>
             <w:shd w:val="clear" w:color="auto" w:fill="FFFFFF"/>
             <w:tcBorders>
               <w:top w:val="single" w:sz="4" w:color="D9DEE5"/>
@@ -5734,7 +5589,7 @@
               <w:spacing w:before="0" w:after="0"/>
             </w:pPr>
             <w:r/>
-            <w:hyperlink r:id="rId23">
+            <w:hyperlink r:id="rId24">
               <w:r>
                 <w:rPr>
                   <w:color w:val="0B2C4D"/>
@@ -5838,7 +5693,7 @@
               <w:spacing w:before="0" w:after="0"/>
             </w:pPr>
             <w:r/>
-            <w:hyperlink r:id="rId23">
+            <w:hyperlink r:id="rId24">
               <w:r>
                 <w:rPr>
                   <w:color w:val="0B2C4D"/>
@@ -5908,7 +5763,7 @@
               <w:spacing w:before="0" w:after="0"/>
             </w:pPr>
             <w:r/>
-            <w:hyperlink r:id="rId24">
+            <w:hyperlink r:id="rId25">
               <w:r>
                 <w:rPr>
                   <w:color w:val="0B2C4D"/>
@@ -6012,7 +5867,7 @@
               <w:spacing w:before="0" w:after="0"/>
             </w:pPr>
             <w:r/>
-            <w:hyperlink r:id="rId24">
+            <w:hyperlink r:id="rId25">
               <w:r>
                 <w:rPr>
                   <w:color w:val="0B2C4D"/>
@@ -6082,7 +5937,7 @@
               <w:spacing w:before="0" w:after="0"/>
             </w:pPr>
             <w:r/>
-            <w:hyperlink r:id="rId25">
+            <w:hyperlink r:id="rId26">
               <w:r>
                 <w:rPr>
                   <w:color w:val="0B2C4D"/>
@@ -6186,7 +6041,7 @@
               <w:spacing w:before="0" w:after="0"/>
             </w:pPr>
             <w:r/>
-            <w:hyperlink r:id="rId25">
+            <w:hyperlink r:id="rId26">
               <w:r>
                 <w:rPr>
                   <w:color w:val="0B2C4D"/>
@@ -6256,7 +6111,7 @@
               <w:spacing w:before="0" w:after="0"/>
             </w:pPr>
             <w:r/>
-            <w:hyperlink r:id="rId26">
+            <w:hyperlink r:id="rId27">
               <w:r>
                 <w:rPr>
                   <w:color w:val="0B2C4D"/>
@@ -6360,7 +6215,7 @@
               <w:spacing w:before="0" w:after="0"/>
             </w:pPr>
             <w:r/>
-            <w:hyperlink r:id="rId26">
+            <w:hyperlink r:id="rId27">
               <w:r>
                 <w:rPr>
                   <w:color w:val="0B2C4D"/>
@@ -6430,7 +6285,7 @@
               <w:spacing w:before="0" w:after="0"/>
             </w:pPr>
             <w:r/>
-            <w:hyperlink r:id="rId27">
+            <w:hyperlink r:id="rId28">
               <w:r>
                 <w:rPr>
                   <w:color w:val="0B2C4D"/>
@@ -6534,7 +6389,7 @@
               <w:spacing w:before="0" w:after="0"/>
             </w:pPr>
             <w:r/>
-            <w:hyperlink r:id="rId27">
+            <w:hyperlink r:id="rId28">
               <w:r>
                 <w:rPr>
                   <w:color w:val="0B2C4D"/>
@@ -6604,7 +6459,7 @@
               <w:spacing w:before="0" w:after="0"/>
             </w:pPr>
             <w:r/>
-            <w:hyperlink r:id="rId28">
+            <w:hyperlink r:id="rId29">
               <w:r>
                 <w:rPr>
                   <w:color w:val="0B2C4D"/>
@@ -6708,7 +6563,7 @@
               <w:spacing w:before="0" w:after="0"/>
             </w:pPr>
             <w:r/>
-            <w:hyperlink r:id="rId28">
+            <w:hyperlink r:id="rId29">
               <w:r>
                 <w:rPr>
                   <w:color w:val="0B2C4D"/>
@@ -6778,7 +6633,7 @@
               <w:spacing w:before="0" w:after="0"/>
             </w:pPr>
             <w:r/>
-            <w:hyperlink r:id="rId29">
+            <w:hyperlink r:id="rId30">
               <w:r>
                 <w:rPr>
                   <w:color w:val="0B2C4D"/>
@@ -6882,7 +6737,7 @@
               <w:spacing w:before="0" w:after="0"/>
             </w:pPr>
             <w:r/>
-            <w:hyperlink r:id="rId29">
+            <w:hyperlink r:id="rId30">
               <w:r>
                 <w:rPr>
                   <w:color w:val="0B2C4D"/>
@@ -6952,7 +6807,7 @@
               <w:spacing w:before="0" w:after="0"/>
             </w:pPr>
             <w:r/>
-            <w:hyperlink r:id="rId30">
+            <w:hyperlink r:id="rId31">
               <w:r>
                 <w:rPr>
                   <w:color w:val="0B2C4D"/>
@@ -7056,7 +6911,7 @@
               <w:spacing w:before="0" w:after="0"/>
             </w:pPr>
             <w:r/>
-            <w:hyperlink r:id="rId30">
+            <w:hyperlink r:id="rId31">
               <w:r>
                 <w:rPr>
                   <w:color w:val="0B2C4D"/>
@@ -7126,7 +6981,7 @@
               <w:spacing w:before="0" w:after="0"/>
             </w:pPr>
             <w:r/>
-            <w:hyperlink r:id="rId31">
+            <w:hyperlink r:id="rId32">
               <w:r>
                 <w:rPr>
                   <w:color w:val="0B2C4D"/>
@@ -7230,7 +7085,7 @@
               <w:spacing w:before="0" w:after="0"/>
             </w:pPr>
             <w:r/>
-            <w:hyperlink r:id="rId31">
+            <w:hyperlink r:id="rId32">
               <w:r>
                 <w:rPr>
                   <w:color w:val="0B2C4D"/>
@@ -7300,7 +7155,7 @@
               <w:spacing w:before="0" w:after="0"/>
             </w:pPr>
             <w:r/>
-            <w:hyperlink r:id="rId32">
+            <w:hyperlink r:id="rId33">
               <w:r>
                 <w:rPr>
                   <w:color w:val="0B2C4D"/>
@@ -7404,7 +7259,7 @@
               <w:spacing w:before="0" w:after="0"/>
             </w:pPr>
             <w:r/>
-            <w:hyperlink r:id="rId32">
+            <w:hyperlink r:id="rId33">
               <w:r>
                 <w:rPr>
                   <w:color w:val="0B2C4D"/>
@@ -7474,7 +7329,7 @@
               <w:spacing w:before="0" w:after="0"/>
             </w:pPr>
             <w:r/>
-            <w:hyperlink r:id="rId33">
+            <w:hyperlink r:id="rId34">
               <w:r>
                 <w:rPr>
                   <w:color w:val="0B2C4D"/>
@@ -7578,7 +7433,7 @@
               <w:spacing w:before="0" w:after="0"/>
             </w:pPr>
             <w:r/>
-            <w:hyperlink r:id="rId33">
+            <w:hyperlink r:id="rId34">
               <w:r>
                 <w:rPr>
                   <w:color w:val="0B2C4D"/>
@@ -7648,7 +7503,7 @@
               <w:spacing w:before="0" w:after="0"/>
             </w:pPr>
             <w:r/>
-            <w:hyperlink r:id="rId34">
+            <w:hyperlink r:id="rId35">
               <w:r>
                 <w:rPr>
                   <w:color w:val="0B2C4D"/>
@@ -7752,7 +7607,7 @@
               <w:spacing w:before="0" w:after="0"/>
             </w:pPr>
             <w:r/>
-            <w:hyperlink r:id="rId34">
+            <w:hyperlink r:id="rId35">
               <w:r>
                 <w:rPr>
                   <w:color w:val="0B2C4D"/>
@@ -7822,7 +7677,7 @@
               <w:spacing w:before="0" w:after="0"/>
             </w:pPr>
             <w:r/>
-            <w:hyperlink r:id="rId35">
+            <w:hyperlink r:id="rId36">
               <w:r>
                 <w:rPr>
                   <w:color w:val="0B2C4D"/>
@@ -7926,7 +7781,7 @@
               <w:spacing w:before="0" w:after="0"/>
             </w:pPr>
             <w:r/>
-            <w:hyperlink r:id="rId35">
+            <w:hyperlink r:id="rId36">
               <w:r>
                 <w:rPr>
                   <w:color w:val="0B2C4D"/>
@@ -8010,9 +7865,7 @@
             <w:pPr>
               <w:jc w:val="center"/>
             </w:pPr>
-            <w:r>
-              <w:t>28 FILLED  ·  5 OPEN  ·  33 TOTAL POSITIONS</w:t>
-            </w:r>
+            <w:r/>
             <w:r>
               <w:rPr>
                 <w:rFonts w:ascii="Calibri Light" w:hAnsi="Calibri Light"/>
@@ -8021,6 +7874,7 @@
                 <w:color w:val="0B2C4D"/>
                 <w:sz w:val="22"/>
               </w:rPr>
+              <w:t>27 FILLED  ·  6 OPEN  ·  33 TOTAL POSITIONS</w:t>
             </w:r>
           </w:p>
         </w:tc>
@@ -8039,7 +7893,7 @@
           <w:color w:val="6B7686"/>
           <w:sz w:val="16"/>
         </w:rPr>
-        <w:t>Updated May 28, 2026</w:t>
+        <w:t>Updated May 29, 2026</w:t>
       </w:r>
     </w:p>
     <w:sectPr>

</xml_diff>